<commit_message>
frisstive a tesztelesi es a hivatalos doksi is
</commit_message>
<xml_diff>
--- a/Tesztelés_dokumentáció.docx
+++ b/Tesztelés_dokumentáció.docx
@@ -11854,7 +11854,7 @@
           </mc:Choice>
           <mc:Fallback>
             <w:pict>
-              <v:shapetype w14:anchorId="5BBFC13A" id="_x0000_t32" coordsize="21600,21600" o:spt="32" o:oned="t" path="m,l21600,21600e" filled="f">
+              <v:shapetype w14:anchorId="36C123CA" id="_x0000_t32" coordsize="21600,21600" o:spt="32" o:oned="t" path="m,l21600,21600e" filled="f">
                 <v:path arrowok="t" fillok="f" o:connecttype="none"/>
                 <o:lock v:ext="edit" shapetype="t"/>
               </v:shapetype>
@@ -11937,7 +11937,7 @@
           </mc:Choice>
           <mc:Fallback>
             <w:pict>
-              <v:rect w14:anchorId="2DB4157F" id="Téglalap 34" o:spid="_x0000_s1026" style="position:absolute;margin-left:1.65pt;margin-top:4.45pt;width:452.1pt;height:27pt;z-index:251739136;visibility:visible;mso-wrap-style:square;mso-wrap-distance-left:9pt;mso-wrap-distance-top:0;mso-wrap-distance-right:9pt;mso-wrap-distance-bottom:0;mso-position-horizontal:absolute;mso-position-horizontal-relative:text;mso-position-vertical:absolute;mso-position-vertical-relative:text;v-text-anchor:middle" o:gfxdata="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" filled="f" strokecolor="#e00" strokeweight="4.5pt"/>
+              <v:rect w14:anchorId="74E80B66" id="Téglalap 34" o:spid="_x0000_s1026" style="position:absolute;margin-left:1.65pt;margin-top:4.45pt;width:452.1pt;height:27pt;z-index:251739136;visibility:visible;mso-wrap-style:square;mso-wrap-distance-left:9pt;mso-wrap-distance-top:0;mso-wrap-distance-right:9pt;mso-wrap-distance-bottom:0;mso-position-horizontal:absolute;mso-position-horizontal-relative:text;mso-position-vertical:absolute;mso-position-vertical-relative:text;v-text-anchor:middle" o:gfxdata="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" filled="f" strokecolor="#e00" strokeweight="4.5pt"/>
             </w:pict>
           </mc:Fallback>
         </mc:AlternateContent>
@@ -12419,7 +12419,7 @@
           </mc:Choice>
           <mc:Fallback>
             <w:pict>
-              <v:shape w14:anchorId="7409478B" id="Egyenes összekötő nyíllal 37" o:spid="_x0000_s1026" type="#_x0000_t32" style="position:absolute;margin-left:57.15pt;margin-top:91.2pt;width:43.5pt;height:209pt;z-index:251744256;visibility:visible;mso-wrap-style:square;mso-width-percent:0;mso-height-percent:0;mso-wrap-distance-left:9pt;mso-wrap-distance-top:0;mso-wrap-distance-right:9pt;mso-wrap-distance-bottom:0;mso-position-horizontal:absolute;mso-position-horizontal-relative:text;mso-position-vertical:absolute;mso-position-vertical-relative:text;mso-width-percent:0;mso-height-percent:0;mso-width-relative:margin;mso-height-relative:margin" o:gfxdata="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" strokecolor="#e00" strokeweight="4.5pt">
+              <v:shape w14:anchorId="6777CB52" id="Egyenes összekötő nyíllal 37" o:spid="_x0000_s1026" type="#_x0000_t32" style="position:absolute;margin-left:57.15pt;margin-top:91.2pt;width:43.5pt;height:209pt;z-index:251744256;visibility:visible;mso-wrap-style:square;mso-width-percent:0;mso-height-percent:0;mso-wrap-distance-left:9pt;mso-wrap-distance-top:0;mso-wrap-distance-right:9pt;mso-wrap-distance-bottom:0;mso-position-horizontal:absolute;mso-position-horizontal-relative:text;mso-position-vertical:absolute;mso-position-vertical-relative:text;mso-width-percent:0;mso-height-percent:0;mso-width-relative:margin;mso-height-relative:margin" o:gfxdata="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" strokecolor="#e00" strokeweight="4.5pt">
                 <v:stroke endarrow="block" joinstyle="miter"/>
               </v:shape>
             </w:pict>
@@ -12497,7 +12497,7 @@
           </mc:Choice>
           <mc:Fallback>
             <w:pict>
-              <v:rect w14:anchorId="64BBB09A" id="Téglalap 36" o:spid="_x0000_s1026" style="position:absolute;margin-left:.65pt;margin-top:52.7pt;width:283pt;height:39pt;z-index:251741184;visibility:visible;mso-wrap-style:square;mso-wrap-distance-left:9pt;mso-wrap-distance-top:0;mso-wrap-distance-right:9pt;mso-wrap-distance-bottom:0;mso-position-horizontal:absolute;mso-position-horizontal-relative:text;mso-position-vertical:absolute;mso-position-vertical-relative:text;v-text-anchor:middle" o:gfxdata="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" filled="f" strokecolor="#e00" strokeweight="4.5pt"/>
+              <v:rect w14:anchorId="074309AA" id="Téglalap 36" o:spid="_x0000_s1026" style="position:absolute;margin-left:.65pt;margin-top:52.7pt;width:283pt;height:39pt;z-index:251741184;visibility:visible;mso-wrap-style:square;mso-wrap-distance-left:9pt;mso-wrap-distance-top:0;mso-wrap-distance-right:9pt;mso-wrap-distance-bottom:0;mso-position-horizontal:absolute;mso-position-horizontal-relative:text;mso-position-vertical:absolute;mso-position-vertical-relative:text;v-text-anchor:middle" o:gfxdata="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" filled="f" strokecolor="#e00" strokeweight="4.5pt"/>
             </w:pict>
           </mc:Fallback>
         </mc:AlternateContent>
@@ -12642,7 +12642,7 @@
           </mc:Choice>
           <mc:Fallback>
             <w:pict>
-              <v:rect w14:anchorId="2A0DCBA9" id="Téglalap 36" o:spid="_x0000_s1026" style="position:absolute;margin-left:0;margin-top:103.95pt;width:282.5pt;height:80pt;z-index:251743232;visibility:visible;mso-wrap-style:square;mso-width-percent:0;mso-height-percent:0;mso-wrap-distance-left:9pt;mso-wrap-distance-top:0;mso-wrap-distance-right:9pt;mso-wrap-distance-bottom:0;mso-position-horizontal:left;mso-position-horizontal-relative:margin;mso-position-vertical:absolute;mso-position-vertical-relative:text;mso-width-percent:0;mso-height-percent:0;mso-width-relative:margin;mso-height-relative:margin;v-text-anchor:middle" o:gfxdata="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" filled="f" strokecolor="#e00" strokeweight="4.5pt">
+              <v:rect w14:anchorId="4B971294" id="Téglalap 36" o:spid="_x0000_s1026" style="position:absolute;margin-left:0;margin-top:103.95pt;width:282.5pt;height:80pt;z-index:251743232;visibility:visible;mso-wrap-style:square;mso-width-percent:0;mso-height-percent:0;mso-wrap-distance-left:9pt;mso-wrap-distance-top:0;mso-wrap-distance-right:9pt;mso-wrap-distance-bottom:0;mso-position-horizontal:left;mso-position-horizontal-relative:margin;mso-position-vertical:absolute;mso-position-vertical-relative:text;mso-width-percent:0;mso-height-percent:0;mso-width-relative:margin;mso-height-relative:margin;v-text-anchor:middle" o:gfxdata="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" filled="f" strokecolor="#e00" strokeweight="4.5pt">
                 <w10:wrap anchorx="margin"/>
               </v:rect>
             </w:pict>
@@ -12704,6 +12704,7 @@
           <w:rStyle w:val="Finomhivatkozs"/>
           <w:rFonts w:ascii="Times New Roman" w:hAnsi="Times New Roman" w:cs="Times New Roman"/>
         </w:rPr>
+        <w:lastRenderedPageBreak/>
         <w:t>Windows szerverszolgáltatások tesztelése</w:t>
       </w:r>
       <w:bookmarkEnd w:id="13"/>
@@ -12715,17 +12716,469 @@
         <w:t xml:space="preserve"> </w:t>
       </w:r>
     </w:p>
-    <w:p/>
-    <w:p/>
-    <w:p/>
+    <w:p>
+      <w:pPr>
+        <w:jc w:val="center"/>
+      </w:pPr>
+      <w:r>
+        <w:drawing>
+          <wp:inline distT="0" distB="0" distL="0" distR="0" wp14:anchorId="40B33BDF" wp14:editId="370CAA30">
+            <wp:extent cx="5420481" cy="4401164"/>
+            <wp:effectExtent l="0" t="0" r="8890" b="0"/>
+            <wp:docPr id="1942150324" name="Kép 1"/>
+            <wp:cNvGraphicFramePr>
+              <a:graphicFrameLocks xmlns:a="http://schemas.openxmlformats.org/drawingml/2006/main" noChangeAspect="1"/>
+            </wp:cNvGraphicFramePr>
+            <a:graphic xmlns:a="http://schemas.openxmlformats.org/drawingml/2006/main">
+              <a:graphicData uri="http://schemas.openxmlformats.org/drawingml/2006/picture">
+                <pic:pic xmlns:pic="http://schemas.openxmlformats.org/drawingml/2006/picture">
+                  <pic:nvPicPr>
+                    <pic:cNvPr id="1942150324" name=""/>
+                    <pic:cNvPicPr/>
+                  </pic:nvPicPr>
+                  <pic:blipFill>
+                    <a:blip r:embed="rId57"/>
+                    <a:stretch>
+                      <a:fillRect/>
+                    </a:stretch>
+                  </pic:blipFill>
+                  <pic:spPr>
+                    <a:xfrm>
+                      <a:off x="0" y="0"/>
+                      <a:ext cx="5420481" cy="4401164"/>
+                    </a:xfrm>
+                    <a:prstGeom prst="rect">
+                      <a:avLst/>
+                    </a:prstGeom>
+                  </pic:spPr>
+                </pic:pic>
+              </a:graphicData>
+            </a:graphic>
+          </wp:inline>
+        </w:drawing>
+      </w:r>
+    </w:p>
+    <w:p>
+      <w:pPr>
+        <w:jc w:val="both"/>
+      </w:pPr>
+      <w:r>
+        <w:t>Miután bedobott a bejelentkezési felületre</w:t>
+      </w:r>
+      <w:r>
+        <w:t xml:space="preserve"> meg kellett változtatni a jelszót a megfelelő szabályok szerint: </w:t>
+      </w:r>
+    </w:p>
+    <w:p>
+      <w:pPr>
+        <w:jc w:val="both"/>
+      </w:pPr>
+      <w:r>
+        <w:t xml:space="preserve">A jelszónak </w:t>
+      </w:r>
+      <w:r>
+        <w:rPr>
+          <w:b/>
+          <w:bCs/>
+        </w:rPr>
+        <w:t>legalább 10 karakter hosszúnak kell lennie</w:t>
+      </w:r>
+      <w:r>
+        <w:t>. Lehet hosszabb is, de rövidebb nem.</w:t>
+      </w:r>
+      <w:r>
+        <w:t xml:space="preserve"> </w:t>
+      </w:r>
+      <w:r>
+        <w:t xml:space="preserve">A Windows komplexitási szabályai szerint a jelszónak </w:t>
+      </w:r>
+      <w:r>
+        <w:rPr>
+          <w:b/>
+          <w:bCs/>
+        </w:rPr>
+        <w:t>legalább 3 kategóriából</w:t>
+      </w:r>
+      <w:r>
+        <w:t xml:space="preserve"> kell tartalmaznia karaktereket az alábbiak közül:</w:t>
+      </w:r>
+    </w:p>
+    <w:p>
+      <w:pPr>
+        <w:numPr>
+          <w:ilvl w:val="0"/>
+          <w:numId w:val="7"/>
+        </w:numPr>
+        <w:jc w:val="both"/>
+      </w:pPr>
+      <w:r>
+        <w:rPr>
+          <w:b/>
+          <w:bCs/>
+        </w:rPr>
+        <w:t>Nagybetűk</w:t>
+      </w:r>
+      <w:r>
+        <w:t xml:space="preserve"> (A–Z)</w:t>
+      </w:r>
+    </w:p>
+    <w:p>
+      <w:pPr>
+        <w:numPr>
+          <w:ilvl w:val="0"/>
+          <w:numId w:val="7"/>
+        </w:numPr>
+        <w:jc w:val="both"/>
+      </w:pPr>
+      <w:r>
+        <w:rPr>
+          <w:b/>
+          <w:bCs/>
+        </w:rPr>
+        <w:t>Kisbetűk</w:t>
+      </w:r>
+      <w:r>
+        <w:t xml:space="preserve"> (a–z)</w:t>
+      </w:r>
+    </w:p>
+    <w:p>
+      <w:pPr>
+        <w:numPr>
+          <w:ilvl w:val="0"/>
+          <w:numId w:val="7"/>
+        </w:numPr>
+        <w:jc w:val="both"/>
+      </w:pPr>
+      <w:r>
+        <w:rPr>
+          <w:b/>
+          <w:bCs/>
+        </w:rPr>
+        <w:t>Számok</w:t>
+      </w:r>
+      <w:r>
+        <w:t xml:space="preserve"> (0–9)</w:t>
+      </w:r>
+    </w:p>
+    <w:p>
+      <w:pPr>
+        <w:numPr>
+          <w:ilvl w:val="0"/>
+          <w:numId w:val="7"/>
+        </w:numPr>
+        <w:jc w:val="both"/>
+      </w:pPr>
+      <w:r>
+        <w:rPr>
+          <w:b/>
+          <w:bCs/>
+        </w:rPr>
+        <w:t>Speciális karakterek</w:t>
+      </w:r>
+      <w:r>
+        <w:t xml:space="preserve"> </w:t>
+      </w:r>
+      <w:proofErr w:type="gramStart"/>
+      <w:r>
+        <w:t>(!,</w:t>
+      </w:r>
+      <w:proofErr w:type="gramEnd"/>
+      <w:r>
+        <w:t xml:space="preserve"> @, #, %, </w:t>
+      </w:r>
+      <w:proofErr w:type="gramStart"/>
+      <w:r>
+        <w:t>*,</w:t>
+      </w:r>
+      <w:proofErr w:type="gramEnd"/>
+      <w:r>
+        <w:t xml:space="preserve"> stb.)</w:t>
+      </w:r>
+    </w:p>
+    <w:p>
+      <w:pPr>
+        <w:jc w:val="both"/>
+      </w:pPr>
+      <w:r>
+        <w:t xml:space="preserve">A jelszó, amit használtam a </w:t>
+      </w:r>
+      <w:r>
+        <w:t>Braun Dénes</w:t>
+      </w:r>
+      <w:r>
+        <w:t xml:space="preserve"> adminisztrátor fiókjához: </w:t>
+      </w:r>
+      <w:r>
+        <w:rPr>
+          <w:highlight w:val="yellow"/>
+        </w:rPr>
+        <w:t>Abcd1234!!</w:t>
+      </w:r>
+    </w:p>
+    <w:p>
+      <w:pPr>
+        <w:jc w:val="center"/>
+      </w:pPr>
+      <w:r>
+        <w:drawing>
+          <wp:inline distT="0" distB="0" distL="0" distR="0" wp14:anchorId="592C9447" wp14:editId="2F6003E4">
+            <wp:extent cx="3241201" cy="1073150"/>
+            <wp:effectExtent l="0" t="0" r="0" b="0"/>
+            <wp:docPr id="1293997083" name="Kép 1"/>
+            <wp:cNvGraphicFramePr>
+              <a:graphicFrameLocks xmlns:a="http://schemas.openxmlformats.org/drawingml/2006/main" noChangeAspect="1"/>
+            </wp:cNvGraphicFramePr>
+            <a:graphic xmlns:a="http://schemas.openxmlformats.org/drawingml/2006/main">
+              <a:graphicData uri="http://schemas.openxmlformats.org/drawingml/2006/picture">
+                <pic:pic xmlns:pic="http://schemas.openxmlformats.org/drawingml/2006/picture">
+                  <pic:nvPicPr>
+                    <pic:cNvPr id="1293997083" name=""/>
+                    <pic:cNvPicPr/>
+                  </pic:nvPicPr>
+                  <pic:blipFill>
+                    <a:blip r:embed="rId58"/>
+                    <a:stretch>
+                      <a:fillRect/>
+                    </a:stretch>
+                  </pic:blipFill>
+                  <pic:spPr>
+                    <a:xfrm>
+                      <a:off x="0" y="0"/>
+                      <a:ext cx="3267944" cy="1082005"/>
+                    </a:xfrm>
+                    <a:prstGeom prst="rect">
+                      <a:avLst/>
+                    </a:prstGeom>
+                  </pic:spPr>
+                </pic:pic>
+              </a:graphicData>
+            </a:graphic>
+          </wp:inline>
+        </w:drawing>
+      </w:r>
+    </w:p>
+    <w:p>
+      <w:pPr>
+        <w:pStyle w:val="Cmsor2"/>
+      </w:pPr>
+      <w:r>
+        <w:lastRenderedPageBreak/>
+        <w:t>AD</w:t>
+      </w:r>
+      <w:r>
+        <w:t>DS és DNS elérés</w:t>
+      </w:r>
+    </w:p>
+    <w:p>
+      <w:pPr>
+        <w:jc w:val="both"/>
+      </w:pPr>
+      <w:r>
+        <w:t>A tartományi kliens megfelelő működésének és a vállalati hálózati erőforrásokhoz való hozzáférés biztosításának érdekében ellenőriztem, hogy a gép képes</w:t>
+      </w:r>
+      <w:r>
+        <w:noBreakHyphen/>
+        <w:t>e elérni a belső tartományt, illetve a külső internetes tartományokat. Ennek részeként megvizsgáltam, hogy a kliens sikeresen fel tudja</w:t>
+      </w:r>
+      <w:r>
+        <w:noBreakHyphen/>
+        <w:t>e oldani és el tudja</w:t>
+      </w:r>
+      <w:r>
+        <w:noBreakHyphen/>
+        <w:t xml:space="preserve">e érni a </w:t>
+      </w:r>
+      <w:proofErr w:type="spellStart"/>
+      <w:r>
+        <w:rPr>
+          <w:b/>
+          <w:bCs/>
+        </w:rPr>
+        <w:t>telekom.lan</w:t>
+      </w:r>
+      <w:proofErr w:type="spellEnd"/>
+      <w:r>
+        <w:t xml:space="preserve"> belső </w:t>
+      </w:r>
+      <w:proofErr w:type="spellStart"/>
+      <w:r>
+        <w:t>domainnevet</w:t>
+      </w:r>
+      <w:proofErr w:type="spellEnd"/>
+      <w:r>
+        <w:t xml:space="preserve">, valamint a </w:t>
+      </w:r>
+      <w:r>
+        <w:rPr>
+          <w:b/>
+          <w:bCs/>
+        </w:rPr>
+        <w:t>telekomworkforce.hu</w:t>
+      </w:r>
+      <w:r>
+        <w:t xml:space="preserve"> külső webcímet.</w:t>
+      </w:r>
+    </w:p>
+    <w:p>
+      <w:pPr>
+        <w:jc w:val="both"/>
+      </w:pPr>
+      <w:r>
+        <w:t>Első lépésként a tartományi kliensen futtattam egy névfeloldási tesztet, amelynek célja annak megállapítása volt, hogy a gép a megfelelő DNS</w:t>
+      </w:r>
+      <w:r>
+        <w:noBreakHyphen/>
+        <w:t>kiszolgálókat használja</w:t>
+      </w:r>
+      <w:r>
+        <w:noBreakHyphen/>
+        <w:t xml:space="preserve">e. A </w:t>
+      </w:r>
+      <w:proofErr w:type="spellStart"/>
+      <w:r>
+        <w:rPr>
+          <w:i/>
+          <w:iCs/>
+        </w:rPr>
+        <w:t>telekom.lan</w:t>
+      </w:r>
+      <w:proofErr w:type="spellEnd"/>
+      <w:r>
+        <w:t xml:space="preserve"> </w:t>
+      </w:r>
+      <w:proofErr w:type="spellStart"/>
+      <w:r>
+        <w:t>domain</w:t>
+      </w:r>
+      <w:proofErr w:type="spellEnd"/>
+      <w:r>
+        <w:t xml:space="preserve"> elérése azért fontos, mert ez a belső </w:t>
+      </w:r>
+      <w:proofErr w:type="spellStart"/>
+      <w:r>
+        <w:t>Active</w:t>
+      </w:r>
+      <w:proofErr w:type="spellEnd"/>
+      <w:r>
+        <w:t xml:space="preserve"> </w:t>
+      </w:r>
+      <w:proofErr w:type="spellStart"/>
+      <w:r>
+        <w:t>Directory</w:t>
+      </w:r>
+      <w:proofErr w:type="spellEnd"/>
+      <w:r>
+        <w:t xml:space="preserve"> tartomány, amelyhez a kliensnek csatlakoznia kell ahhoz, hogy a csoportházirendek, a hitelesítés és a tartományi szolgáltatások megfelelően működjenek. A névfeloldás sikeres lefutása igazolja, hogy a kliens a tartományi DNS</w:t>
+      </w:r>
+      <w:r>
+        <w:noBreakHyphen/>
+        <w:t xml:space="preserve">szervereket használja, és képes kommunikálni a </w:t>
+      </w:r>
+      <w:proofErr w:type="spellStart"/>
+      <w:r>
+        <w:t>domain</w:t>
+      </w:r>
+      <w:proofErr w:type="spellEnd"/>
+      <w:r>
+        <w:t xml:space="preserve"> </w:t>
+      </w:r>
+      <w:proofErr w:type="spellStart"/>
+      <w:r>
+        <w:t>controllerrel</w:t>
+      </w:r>
+      <w:proofErr w:type="spellEnd"/>
+      <w:r>
+        <w:t>.</w:t>
+      </w:r>
+    </w:p>
+    <w:p>
+      <w:pPr>
+        <w:jc w:val="both"/>
+      </w:pPr>
+      <w:r>
+        <w:t xml:space="preserve">Ezt követően ellenőriztem a </w:t>
+      </w:r>
+      <w:r>
+        <w:rPr>
+          <w:i/>
+          <w:iCs/>
+        </w:rPr>
+        <w:t>telekomworkforce.hu</w:t>
+      </w:r>
+      <w:r>
+        <w:t xml:space="preserve"> külső </w:t>
+      </w:r>
+      <w:proofErr w:type="spellStart"/>
+      <w:r>
+        <w:t>domain</w:t>
+      </w:r>
+      <w:proofErr w:type="spellEnd"/>
+      <w:r>
+        <w:t xml:space="preserve"> elérhetőségét is. Ez a lépés azt vizsgálja, hogy a kliens megfelelő internetkapcsolattal rendelkezik</w:t>
+      </w:r>
+      <w:r>
+        <w:noBreakHyphen/>
+        <w:t>e, és a DNS</w:t>
+      </w:r>
+      <w:r>
+        <w:noBreakHyphen/>
+        <w:t>kiszolgálók képesek</w:t>
+      </w:r>
+      <w:r>
+        <w:noBreakHyphen/>
+        <w:t>e külső webcímeket is feloldani. A sikeres elérés azt bizonyítja, hogy a hálózati forgalom kifelé is működik, a tűzfal nem blokkolja az alapvető webes kommunikációt, és a kliens képes elérni a vállalat által használt külső szolgáltatásokat.</w:t>
+      </w:r>
+    </w:p>
     <w:p>
       <w:pPr>
         <w:pStyle w:val="bum"/>
-        <w:rPr>
-          <w:rStyle w:val="Finomhivatkozs"/>
-          <w:rFonts w:ascii="Times New Roman" w:hAnsi="Times New Roman" w:cs="Times New Roman"/>
-        </w:rPr>
-      </w:pPr>
+        <w:jc w:val="center"/>
+        <w:rPr>
+          <w:rStyle w:val="Finomhivatkozs"/>
+          <w:rFonts w:ascii="Times New Roman" w:hAnsi="Times New Roman" w:cs="Times New Roman"/>
+        </w:rPr>
+      </w:pPr>
+      <w:r>
+        <w:rPr>
+          <w:rStyle w:val="Finomhivatkozs"/>
+          <w:rFonts w:ascii="Times New Roman" w:hAnsi="Times New Roman" w:cs="Times New Roman"/>
+        </w:rPr>
+        <w:drawing>
+          <wp:inline distT="0" distB="0" distL="0" distR="0" wp14:anchorId="34674DDC" wp14:editId="403312A0">
+            <wp:extent cx="4514850" cy="4137617"/>
+            <wp:effectExtent l="0" t="0" r="0" b="0"/>
+            <wp:docPr id="52002225" name="Kép 1"/>
+            <wp:cNvGraphicFramePr>
+              <a:graphicFrameLocks xmlns:a="http://schemas.openxmlformats.org/drawingml/2006/main" noChangeAspect="1"/>
+            </wp:cNvGraphicFramePr>
+            <a:graphic xmlns:a="http://schemas.openxmlformats.org/drawingml/2006/main">
+              <a:graphicData uri="http://schemas.openxmlformats.org/drawingml/2006/picture">
+                <pic:pic xmlns:pic="http://schemas.openxmlformats.org/drawingml/2006/picture">
+                  <pic:nvPicPr>
+                    <pic:cNvPr id="52002225" name=""/>
+                    <pic:cNvPicPr/>
+                  </pic:nvPicPr>
+                  <pic:blipFill>
+                    <a:blip r:embed="rId59"/>
+                    <a:stretch>
+                      <a:fillRect/>
+                    </a:stretch>
+                  </pic:blipFill>
+                  <pic:spPr>
+                    <a:xfrm>
+                      <a:off x="0" y="0"/>
+                      <a:ext cx="4518917" cy="4141345"/>
+                    </a:xfrm>
+                    <a:prstGeom prst="rect">
+                      <a:avLst/>
+                    </a:prstGeom>
+                  </pic:spPr>
+                </pic:pic>
+              </a:graphicData>
+            </a:graphic>
+          </wp:inline>
+        </w:drawing>
+      </w:r>
     </w:p>
     <w:p>
       <w:pPr>
@@ -12744,15 +13197,203 @@
           <w:rFonts w:ascii="Times New Roman" w:hAnsi="Times New Roman" w:cs="Times New Roman"/>
         </w:rPr>
       </w:pPr>
+      <w:r>
+        <w:rPr>
+          <w:rStyle w:val="Finomhivatkozs"/>
+          <w:rFonts w:ascii="Times New Roman" w:hAnsi="Times New Roman" w:cs="Times New Roman"/>
+        </w:rPr>
+        <w:lastRenderedPageBreak/>
+        <w:t xml:space="preserve">Most megnézem, hogy a </w:t>
+      </w:r>
+      <w:proofErr w:type="spellStart"/>
+      <w:r>
+        <w:rPr>
+          <w:rStyle w:val="Finomhivatkozs"/>
+          <w:rFonts w:ascii="Times New Roman" w:hAnsi="Times New Roman" w:cs="Times New Roman"/>
+        </w:rPr>
+        <w:t>lock</w:t>
+      </w:r>
+      <w:proofErr w:type="spellEnd"/>
+      <w:r>
+        <w:rPr>
+          <w:rStyle w:val="Finomhivatkozs"/>
+          <w:rFonts w:ascii="Times New Roman" w:hAnsi="Times New Roman" w:cs="Times New Roman"/>
+        </w:rPr>
+        <w:t xml:space="preserve"> </w:t>
+      </w:r>
+      <w:proofErr w:type="spellStart"/>
+      <w:r>
+        <w:rPr>
+          <w:rStyle w:val="Finomhivatkozs"/>
+          <w:rFonts w:ascii="Times New Roman" w:hAnsi="Times New Roman" w:cs="Times New Roman"/>
+        </w:rPr>
+        <w:t>screen</w:t>
+      </w:r>
+      <w:proofErr w:type="spellEnd"/>
+      <w:r>
+        <w:rPr>
+          <w:rStyle w:val="Finomhivatkozs"/>
+          <w:rFonts w:ascii="Times New Roman" w:hAnsi="Times New Roman" w:cs="Times New Roman"/>
+        </w:rPr>
+        <w:t xml:space="preserve"> állítás</w:t>
+      </w:r>
+      <w:r>
+        <w:rPr>
+          <w:rStyle w:val="Finomhivatkozs"/>
+          <w:rFonts w:ascii="Times New Roman" w:hAnsi="Times New Roman" w:cs="Times New Roman"/>
+        </w:rPr>
+        <w:t xml:space="preserve"> és egyéb személyre szabás</w:t>
+      </w:r>
+      <w:r>
+        <w:rPr>
+          <w:rStyle w:val="Finomhivatkozs"/>
+          <w:rFonts w:ascii="Times New Roman" w:hAnsi="Times New Roman" w:cs="Times New Roman"/>
+        </w:rPr>
+        <w:t xml:space="preserve"> tényleg le van-e tiltva a testcomputeren</w:t>
+      </w:r>
+      <w:r>
+        <w:rPr>
+          <w:rStyle w:val="Finomhivatkozs"/>
+          <w:rFonts w:ascii="Times New Roman" w:hAnsi="Times New Roman" w:cs="Times New Roman"/>
+        </w:rPr>
+        <w:t xml:space="preserve">: </w:t>
+      </w:r>
+      <w:r>
+        <w:rPr>
+          <w:rStyle w:val="Finomhivatkozs"/>
+          <w:rFonts w:ascii="Times New Roman" w:hAnsi="Times New Roman" w:cs="Times New Roman"/>
+        </w:rPr>
+        <w:t>amint látszik nem lehet módosítani, vagyis a GPO helyesen működik</w:t>
+      </w:r>
+      <w:r>
+        <w:rPr>
+          <w:rStyle w:val="Finomhivatkozs"/>
+          <w:rFonts w:ascii="Times New Roman" w:hAnsi="Times New Roman" w:cs="Times New Roman"/>
+        </w:rPr>
+        <w:t xml:space="preserve">. </w:t>
+      </w:r>
     </w:p>
     <w:p>
       <w:pPr>
         <w:pStyle w:val="bum"/>
-        <w:rPr>
-          <w:rStyle w:val="Finomhivatkozs"/>
-          <w:rFonts w:ascii="Times New Roman" w:hAnsi="Times New Roman" w:cs="Times New Roman"/>
-        </w:rPr>
-      </w:pPr>
+        <w:jc w:val="center"/>
+        <w:rPr>
+          <w:rStyle w:val="Finomhivatkozs"/>
+          <w:rFonts w:ascii="Times New Roman" w:hAnsi="Times New Roman" w:cs="Times New Roman"/>
+        </w:rPr>
+      </w:pPr>
+      <w:r>
+        <w:rPr>
+          <w:rFonts w:ascii="Times New Roman" w:hAnsi="Times New Roman" w:cs="Times New Roman"/>
+          <w:smallCaps/>
+          <w:noProof/>
+          <w:color w:val="5A5A5A" w:themeColor="text1" w:themeTint="A5"/>
+        </w:rPr>
+        <mc:AlternateContent>
+          <mc:Choice Requires="wps">
+            <w:drawing>
+              <wp:anchor distT="0" distB="0" distL="114300" distR="114300" simplePos="0" relativeHeight="251745280" behindDoc="0" locked="0" layoutInCell="1" allowOverlap="1" wp14:anchorId="6DB81296" wp14:editId="76C406B9">
+                <wp:simplePos x="0" y="0"/>
+                <wp:positionH relativeFrom="column">
+                  <wp:posOffset>1525905</wp:posOffset>
+                </wp:positionH>
+                <wp:positionV relativeFrom="paragraph">
+                  <wp:posOffset>1016635</wp:posOffset>
+                </wp:positionV>
+                <wp:extent cx="1314450" cy="0"/>
+                <wp:effectExtent l="0" t="19050" r="38100" b="38100"/>
+                <wp:wrapNone/>
+                <wp:docPr id="958655300" name="Egyenes összekötő 38"/>
+                <wp:cNvGraphicFramePr/>
+                <a:graphic xmlns:a="http://schemas.openxmlformats.org/drawingml/2006/main">
+                  <a:graphicData uri="http://schemas.microsoft.com/office/word/2010/wordprocessingShape">
+                    <wps:wsp>
+                      <wps:cNvCnPr/>
+                      <wps:spPr>
+                        <a:xfrm>
+                          <a:off x="0" y="0"/>
+                          <a:ext cx="1314450" cy="0"/>
+                        </a:xfrm>
+                        <a:prstGeom prst="line">
+                          <a:avLst/>
+                        </a:prstGeom>
+                        <a:ln w="57150">
+                          <a:solidFill>
+                            <a:srgbClr val="EE0000"/>
+                          </a:solidFill>
+                        </a:ln>
+                      </wps:spPr>
+                      <wps:style>
+                        <a:lnRef idx="2">
+                          <a:schemeClr val="accent1"/>
+                        </a:lnRef>
+                        <a:fillRef idx="0">
+                          <a:schemeClr val="accent1"/>
+                        </a:fillRef>
+                        <a:effectRef idx="1">
+                          <a:schemeClr val="accent1"/>
+                        </a:effectRef>
+                        <a:fontRef idx="minor">
+                          <a:schemeClr val="tx1"/>
+                        </a:fontRef>
+                      </wps:style>
+                      <wps:bodyPr/>
+                    </wps:wsp>
+                  </a:graphicData>
+                </a:graphic>
+              </wp:anchor>
+            </w:drawing>
+          </mc:Choice>
+          <mc:Fallback>
+            <w:pict>
+              <v:line w14:anchorId="5E38C462" id="Egyenes összekötő 38" o:spid="_x0000_s1026" style="position:absolute;z-index:251745280;visibility:visible;mso-wrap-style:square;mso-wrap-distance-left:9pt;mso-wrap-distance-top:0;mso-wrap-distance-right:9pt;mso-wrap-distance-bottom:0;mso-position-horizontal:absolute;mso-position-horizontal-relative:text;mso-position-vertical:absolute;mso-position-vertical-relative:text" from="120.15pt,80.05pt" to="223.65pt,80.05pt" o:gfxdata="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" strokecolor="#e00" strokeweight="4.5pt">
+                <v:stroke joinstyle="miter"/>
+              </v:line>
+            </w:pict>
+          </mc:Fallback>
+        </mc:AlternateContent>
+      </w:r>
+      <w:r>
+        <w:rPr>
+          <w:rStyle w:val="Finomhivatkozs"/>
+          <w:rFonts w:ascii="Times New Roman" w:hAnsi="Times New Roman" w:cs="Times New Roman"/>
+        </w:rPr>
+        <w:drawing>
+          <wp:inline distT="0" distB="0" distL="0" distR="0" wp14:anchorId="08F96F6F" wp14:editId="62416D6D">
+            <wp:extent cx="5760720" cy="2985135"/>
+            <wp:effectExtent l="0" t="0" r="0" b="5715"/>
+            <wp:docPr id="580946240" name="Kép 1"/>
+            <wp:cNvGraphicFramePr>
+              <a:graphicFrameLocks xmlns:a="http://schemas.openxmlformats.org/drawingml/2006/main" noChangeAspect="1"/>
+            </wp:cNvGraphicFramePr>
+            <a:graphic xmlns:a="http://schemas.openxmlformats.org/drawingml/2006/main">
+              <a:graphicData uri="http://schemas.openxmlformats.org/drawingml/2006/picture">
+                <pic:pic xmlns:pic="http://schemas.openxmlformats.org/drawingml/2006/picture">
+                  <pic:nvPicPr>
+                    <pic:cNvPr id="580946240" name=""/>
+                    <pic:cNvPicPr/>
+                  </pic:nvPicPr>
+                  <pic:blipFill>
+                    <a:blip r:embed="rId60"/>
+                    <a:stretch>
+                      <a:fillRect/>
+                    </a:stretch>
+                  </pic:blipFill>
+                  <pic:spPr>
+                    <a:xfrm>
+                      <a:off x="0" y="0"/>
+                      <a:ext cx="5760720" cy="2985135"/>
+                    </a:xfrm>
+                    <a:prstGeom prst="rect">
+                      <a:avLst/>
+                    </a:prstGeom>
+                  </pic:spPr>
+                </pic:pic>
+              </a:graphicData>
+            </a:graphic>
+          </wp:inline>
+        </w:drawing>
+      </w:r>
     </w:p>
     <w:p>
       <w:pPr>
@@ -12767,11 +13408,837 @@
           <w:rStyle w:val="Finomhivatkozs"/>
           <w:rFonts w:ascii="Times New Roman" w:hAnsi="Times New Roman" w:cs="Times New Roman"/>
         </w:rPr>
-        <w:tab/>
-      </w:r>
+        <w:t xml:space="preserve">DHCP szolgáltatás rendes működését is ellenőrzöm, megnézem, hogy megfelelő címet, </w:t>
+      </w:r>
+      <w:proofErr w:type="spellStart"/>
+      <w:r>
+        <w:rPr>
+          <w:rStyle w:val="Finomhivatkozs"/>
+          <w:rFonts w:ascii="Times New Roman" w:hAnsi="Times New Roman" w:cs="Times New Roman"/>
+        </w:rPr>
+        <w:t>gatewayt</w:t>
+      </w:r>
+      <w:proofErr w:type="spellEnd"/>
+      <w:r>
+        <w:rPr>
+          <w:rStyle w:val="Finomhivatkozs"/>
+          <w:rFonts w:ascii="Times New Roman" w:hAnsi="Times New Roman" w:cs="Times New Roman"/>
+        </w:rPr>
+        <w:t xml:space="preserve"> és </w:t>
+      </w:r>
+      <w:proofErr w:type="spellStart"/>
+      <w:r>
+        <w:rPr>
+          <w:rStyle w:val="Finomhivatkozs"/>
+          <w:rFonts w:ascii="Times New Roman" w:hAnsi="Times New Roman" w:cs="Times New Roman"/>
+        </w:rPr>
+        <w:t>dns-t</w:t>
+      </w:r>
+      <w:proofErr w:type="spellEnd"/>
+      <w:r>
+        <w:rPr>
+          <w:rStyle w:val="Finomhivatkozs"/>
+          <w:rFonts w:ascii="Times New Roman" w:hAnsi="Times New Roman" w:cs="Times New Roman"/>
+        </w:rPr>
+        <w:t xml:space="preserve"> kapott a tartományi kliens</w:t>
+      </w:r>
+      <w:r>
+        <w:rPr>
+          <w:rStyle w:val="Finomhivatkozs"/>
+          <w:rFonts w:ascii="Times New Roman" w:hAnsi="Times New Roman" w:cs="Times New Roman"/>
+        </w:rPr>
+        <w:t xml:space="preserve">, először elengedem az </w:t>
+      </w:r>
+      <w:proofErr w:type="spellStart"/>
+      <w:r>
+        <w:rPr>
+          <w:rStyle w:val="Finomhivatkozs"/>
+          <w:rFonts w:ascii="Times New Roman" w:hAnsi="Times New Roman" w:cs="Times New Roman"/>
+        </w:rPr>
+        <w:t>ipconfigot</w:t>
+      </w:r>
+      <w:proofErr w:type="spellEnd"/>
+      <w:r>
+        <w:rPr>
+          <w:rStyle w:val="Finomhivatkozs"/>
+          <w:rFonts w:ascii="Times New Roman" w:hAnsi="Times New Roman" w:cs="Times New Roman"/>
+        </w:rPr>
+        <w:t xml:space="preserve"> aztán újra adok neki </w:t>
+      </w:r>
+      <w:proofErr w:type="spellStart"/>
+      <w:r>
+        <w:rPr>
+          <w:rStyle w:val="Finomhivatkozs"/>
+          <w:rFonts w:ascii="Times New Roman" w:hAnsi="Times New Roman" w:cs="Times New Roman"/>
+        </w:rPr>
+        <w:t>dhcp-vel</w:t>
+      </w:r>
+      <w:proofErr w:type="spellEnd"/>
+      <w:r>
+        <w:rPr>
+          <w:rStyle w:val="Finomhivatkozs"/>
+          <w:rFonts w:ascii="Times New Roman" w:hAnsi="Times New Roman" w:cs="Times New Roman"/>
+        </w:rPr>
+        <w:t xml:space="preserve">: </w:t>
+      </w:r>
+    </w:p>
+    <w:p>
+      <w:pPr>
+        <w:pStyle w:val="bum"/>
+        <w:jc w:val="center"/>
+        <w:rPr>
+          <w:rStyle w:val="Finomhivatkozs"/>
+          <w:rFonts w:ascii="Times New Roman" w:hAnsi="Times New Roman" w:cs="Times New Roman"/>
+        </w:rPr>
+      </w:pPr>
+      <w:r>
+        <w:rPr>
+          <w:rFonts w:ascii="Times New Roman" w:hAnsi="Times New Roman" w:cs="Times New Roman"/>
+          <w:smallCaps/>
+          <w:noProof/>
+          <w:color w:val="5A5A5A" w:themeColor="text1" w:themeTint="A5"/>
+        </w:rPr>
+        <mc:AlternateContent>
+          <mc:Choice Requires="wps">
+            <w:drawing>
+              <wp:anchor distT="0" distB="0" distL="114300" distR="114300" simplePos="0" relativeHeight="251746304" behindDoc="0" locked="0" layoutInCell="1" allowOverlap="1" wp14:anchorId="3A260BF9" wp14:editId="2717D405">
+                <wp:simplePos x="0" y="0"/>
+                <wp:positionH relativeFrom="column">
+                  <wp:posOffset>4053205</wp:posOffset>
+                </wp:positionH>
+                <wp:positionV relativeFrom="paragraph">
+                  <wp:posOffset>2654935</wp:posOffset>
+                </wp:positionV>
+                <wp:extent cx="850900" cy="260350"/>
+                <wp:effectExtent l="19050" t="19050" r="25400" b="44450"/>
+                <wp:wrapNone/>
+                <wp:docPr id="1134339289" name="Nyíl: balra mutató 39"/>
+                <wp:cNvGraphicFramePr/>
+                <a:graphic xmlns:a="http://schemas.openxmlformats.org/drawingml/2006/main">
+                  <a:graphicData uri="http://schemas.microsoft.com/office/word/2010/wordprocessingShape">
+                    <wps:wsp>
+                      <wps:cNvSpPr/>
+                      <wps:spPr>
+                        <a:xfrm>
+                          <a:off x="0" y="0"/>
+                          <a:ext cx="850900" cy="260350"/>
+                        </a:xfrm>
+                        <a:prstGeom prst="leftArrow">
+                          <a:avLst/>
+                        </a:prstGeom>
+                        <a:solidFill>
+                          <a:srgbClr val="EE0000"/>
+                        </a:solidFill>
+                        <a:ln>
+                          <a:solidFill>
+                            <a:srgbClr val="EE0000"/>
+                          </a:solidFill>
+                        </a:ln>
+                      </wps:spPr>
+                      <wps:style>
+                        <a:lnRef idx="2">
+                          <a:schemeClr val="accent1">
+                            <a:shade val="15000"/>
+                          </a:schemeClr>
+                        </a:lnRef>
+                        <a:fillRef idx="1">
+                          <a:schemeClr val="accent1"/>
+                        </a:fillRef>
+                        <a:effectRef idx="0">
+                          <a:schemeClr val="accent1"/>
+                        </a:effectRef>
+                        <a:fontRef idx="minor">
+                          <a:schemeClr val="lt1"/>
+                        </a:fontRef>
+                      </wps:style>
+                      <wps:bodyPr rot="0" spcFirstLastPara="0" vertOverflow="overflow" horzOverflow="overflow" vert="horz" wrap="square" lIns="91440" tIns="45720" rIns="91440" bIns="45720" numCol="1" spcCol="0" rtlCol="0" fromWordArt="0" anchor="ctr" anchorCtr="0" forceAA="0" compatLnSpc="1">
+                        <a:prstTxWarp prst="textNoShape">
+                          <a:avLst/>
+                        </a:prstTxWarp>
+                        <a:noAutofit/>
+                      </wps:bodyPr>
+                    </wps:wsp>
+                  </a:graphicData>
+                </a:graphic>
+              </wp:anchor>
+            </w:drawing>
+          </mc:Choice>
+          <mc:Fallback>
+            <w:pict>
+              <v:shapetype w14:anchorId="5A2D9160" id="_x0000_t66" coordsize="21600,21600" o:spt="66" adj="5400,5400" path="m@0,l@0@1,21600@1,21600@2@0@2@0,21600,,10800xe">
+                <v:stroke joinstyle="miter"/>
+                <v:formulas>
+                  <v:f eqn="val #0"/>
+                  <v:f eqn="val #1"/>
+                  <v:f eqn="sum 21600 0 #1"/>
+                  <v:f eqn="prod #0 #1 10800"/>
+                  <v:f eqn="sum #0 0 @3"/>
+                </v:formulas>
+                <v:path o:connecttype="custom" o:connectlocs="@0,0;0,10800;@0,21600;21600,10800" o:connectangles="270,180,90,0" textboxrect="@4,@1,21600,@2"/>
+                <v:handles>
+                  <v:h position="#0,#1" xrange="0,21600" yrange="0,10800"/>
+                </v:handles>
+              </v:shapetype>
+              <v:shape id="Nyíl: balra mutató 39" o:spid="_x0000_s1026" type="#_x0000_t66" style="position:absolute;margin-left:319.15pt;margin-top:209.05pt;width:67pt;height:20.5pt;z-index:251746304;visibility:visible;mso-wrap-style:square;mso-wrap-distance-left:9pt;mso-wrap-distance-top:0;mso-wrap-distance-right:9pt;mso-wrap-distance-bottom:0;mso-position-horizontal:absolute;mso-position-horizontal-relative:text;mso-position-vertical:absolute;mso-position-vertical-relative:text;v-text-anchor:middle" o:gfxdata="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" adj="3304" fillcolor="#e00" strokecolor="#e00" strokeweight="1.5pt"/>
+            </w:pict>
+          </mc:Fallback>
+        </mc:AlternateContent>
+      </w:r>
+      <w:r>
+        <w:rPr>
+          <w:rStyle w:val="Finomhivatkozs"/>
+          <w:rFonts w:ascii="Times New Roman" w:hAnsi="Times New Roman" w:cs="Times New Roman"/>
+        </w:rPr>
+        <w:drawing>
+          <wp:inline distT="0" distB="0" distL="0" distR="0" wp14:anchorId="5A75B9B2" wp14:editId="7A9040AD">
+            <wp:extent cx="4305300" cy="3924694"/>
+            <wp:effectExtent l="0" t="0" r="0" b="0"/>
+            <wp:docPr id="1590175229" name="Kép 1"/>
+            <wp:cNvGraphicFramePr>
+              <a:graphicFrameLocks xmlns:a="http://schemas.openxmlformats.org/drawingml/2006/main" noChangeAspect="1"/>
+            </wp:cNvGraphicFramePr>
+            <a:graphic xmlns:a="http://schemas.openxmlformats.org/drawingml/2006/main">
+              <a:graphicData uri="http://schemas.openxmlformats.org/drawingml/2006/picture">
+                <pic:pic xmlns:pic="http://schemas.openxmlformats.org/drawingml/2006/picture">
+                  <pic:nvPicPr>
+                    <pic:cNvPr id="1590175229" name=""/>
+                    <pic:cNvPicPr/>
+                  </pic:nvPicPr>
+                  <pic:blipFill>
+                    <a:blip r:embed="rId61"/>
+                    <a:stretch>
+                      <a:fillRect/>
+                    </a:stretch>
+                  </pic:blipFill>
+                  <pic:spPr>
+                    <a:xfrm>
+                      <a:off x="0" y="0"/>
+                      <a:ext cx="4313510" cy="3932178"/>
+                    </a:xfrm>
+                    <a:prstGeom prst="rect">
+                      <a:avLst/>
+                    </a:prstGeom>
+                  </pic:spPr>
+                </pic:pic>
+              </a:graphicData>
+            </a:graphic>
+          </wp:inline>
+        </w:drawing>
+      </w:r>
+    </w:p>
+    <w:p>
+      <w:pPr>
+        <w:pStyle w:val="bum"/>
+        <w:rPr>
+          <w:rStyle w:val="Finomhivatkozs"/>
+          <w:rFonts w:ascii="Times New Roman" w:hAnsi="Times New Roman" w:cs="Times New Roman"/>
+        </w:rPr>
+      </w:pPr>
+      <w:r>
+        <w:rPr>
+          <w:rStyle w:val="Finomhivatkozs"/>
+          <w:rFonts w:ascii="Times New Roman" w:hAnsi="Times New Roman" w:cs="Times New Roman"/>
+        </w:rPr>
+        <w:lastRenderedPageBreak/>
+        <w:t>GPO update teszt:</w:t>
+      </w:r>
+    </w:p>
+    <w:p>
+      <w:pPr>
+        <w:pStyle w:val="bum"/>
+        <w:numPr>
+          <w:ilvl w:val="0"/>
+          <w:numId w:val="8"/>
+        </w:numPr>
+        <w:spacing w:after="0"/>
+        <w:ind w:left="714" w:hanging="357"/>
+        <w:rPr>
+          <w:rStyle w:val="Finomhivatkozs"/>
+          <w:rFonts w:ascii="Times New Roman" w:hAnsi="Times New Roman" w:cs="Times New Roman"/>
+        </w:rPr>
+      </w:pPr>
+      <w:proofErr w:type="spellStart"/>
+      <w:r>
+        <w:rPr>
+          <w:rStyle w:val="Finomhivatkozs"/>
+          <w:rFonts w:ascii="Times New Roman" w:hAnsi="Times New Roman" w:cs="Times New Roman"/>
+        </w:rPr>
+        <w:t>gpupdate</w:t>
+      </w:r>
+      <w:proofErr w:type="spellEnd"/>
+      <w:r>
+        <w:rPr>
+          <w:rStyle w:val="Finomhivatkozs"/>
+          <w:rFonts w:ascii="Times New Roman" w:hAnsi="Times New Roman" w:cs="Times New Roman"/>
+        </w:rPr>
+        <w:t xml:space="preserve"> /</w:t>
+      </w:r>
+      <w:proofErr w:type="spellStart"/>
+      <w:r>
+        <w:rPr>
+          <w:rStyle w:val="Finomhivatkozs"/>
+          <w:rFonts w:ascii="Times New Roman" w:hAnsi="Times New Roman" w:cs="Times New Roman"/>
+        </w:rPr>
+        <w:t>force</w:t>
+      </w:r>
+      <w:proofErr w:type="spellEnd"/>
+    </w:p>
+    <w:p>
+      <w:pPr>
+        <w:pStyle w:val="bum"/>
+        <w:numPr>
+          <w:ilvl w:val="0"/>
+          <w:numId w:val="8"/>
+        </w:numPr>
+        <w:spacing w:after="0"/>
+        <w:ind w:left="714" w:hanging="357"/>
+        <w:rPr>
+          <w:rStyle w:val="Finomhivatkozs"/>
+          <w:rFonts w:ascii="Times New Roman" w:hAnsi="Times New Roman" w:cs="Times New Roman"/>
+        </w:rPr>
+      </w:pPr>
+      <w:proofErr w:type="spellStart"/>
+      <w:r>
+        <w:rPr>
+          <w:rStyle w:val="Finomhivatkozs"/>
+          <w:rFonts w:ascii="Times New Roman" w:hAnsi="Times New Roman" w:cs="Times New Roman"/>
+        </w:rPr>
+        <w:t>gpresult</w:t>
+      </w:r>
+      <w:proofErr w:type="spellEnd"/>
+      <w:r>
+        <w:rPr>
+          <w:rStyle w:val="Finomhivatkozs"/>
+          <w:rFonts w:ascii="Times New Roman" w:hAnsi="Times New Roman" w:cs="Times New Roman"/>
+        </w:rPr>
+        <w:t xml:space="preserve"> /</w:t>
+      </w:r>
+      <w:r>
+        <w:rPr>
+          <w:rStyle w:val="Finomhivatkozs"/>
+          <w:rFonts w:ascii="Times New Roman" w:hAnsi="Times New Roman" w:cs="Times New Roman"/>
+        </w:rPr>
+        <w:t>r</w:t>
+      </w:r>
+    </w:p>
+    <w:p>
+      <w:pPr>
+        <w:pStyle w:val="bum"/>
+        <w:spacing w:after="0"/>
+        <w:jc w:val="center"/>
+        <w:rPr>
+          <w:rStyle w:val="Finomhivatkozs"/>
+          <w:rFonts w:ascii="Times New Roman" w:hAnsi="Times New Roman" w:cs="Times New Roman"/>
+        </w:rPr>
+      </w:pPr>
+      <w:r>
+        <w:rPr>
+          <w:rStyle w:val="Finomhivatkozs"/>
+          <w:rFonts w:ascii="Times New Roman" w:hAnsi="Times New Roman" w:cs="Times New Roman"/>
+        </w:rPr>
+        <w:drawing>
+          <wp:inline distT="0" distB="0" distL="0" distR="0" wp14:anchorId="1E923897" wp14:editId="0C803A78">
+            <wp:extent cx="5760720" cy="5450205"/>
+            <wp:effectExtent l="0" t="0" r="0" b="0"/>
+            <wp:docPr id="1620092537" name="Kép 1"/>
+            <wp:cNvGraphicFramePr>
+              <a:graphicFrameLocks xmlns:a="http://schemas.openxmlformats.org/drawingml/2006/main" noChangeAspect="1"/>
+            </wp:cNvGraphicFramePr>
+            <a:graphic xmlns:a="http://schemas.openxmlformats.org/drawingml/2006/main">
+              <a:graphicData uri="http://schemas.openxmlformats.org/drawingml/2006/picture">
+                <pic:pic xmlns:pic="http://schemas.openxmlformats.org/drawingml/2006/picture">
+                  <pic:nvPicPr>
+                    <pic:cNvPr id="1620092537" name=""/>
+                    <pic:cNvPicPr/>
+                  </pic:nvPicPr>
+                  <pic:blipFill>
+                    <a:blip r:embed="rId62"/>
+                    <a:stretch>
+                      <a:fillRect/>
+                    </a:stretch>
+                  </pic:blipFill>
+                  <pic:spPr>
+                    <a:xfrm>
+                      <a:off x="0" y="0"/>
+                      <a:ext cx="5760720" cy="5450205"/>
+                    </a:xfrm>
+                    <a:prstGeom prst="rect">
+                      <a:avLst/>
+                    </a:prstGeom>
+                  </pic:spPr>
+                </pic:pic>
+              </a:graphicData>
+            </a:graphic>
+          </wp:inline>
+        </w:drawing>
+      </w:r>
+    </w:p>
+    <w:p>
+      <w:pPr>
+        <w:pStyle w:val="bum"/>
+        <w:spacing w:after="0"/>
+        <w:rPr>
+          <w:rStyle w:val="Finomhivatkozs"/>
+          <w:rFonts w:ascii="Times New Roman" w:hAnsi="Times New Roman" w:cs="Times New Roman"/>
+        </w:rPr>
+      </w:pPr>
+    </w:p>
+    <w:p>
+      <w:pPr>
+        <w:pStyle w:val="bum"/>
+        <w:spacing w:after="0"/>
+        <w:rPr>
+          <w:rStyle w:val="Finomhivatkozs"/>
+          <w:rFonts w:ascii="Times New Roman" w:hAnsi="Times New Roman" w:cs="Times New Roman"/>
+        </w:rPr>
+      </w:pPr>
+    </w:p>
+    <w:p>
+      <w:pPr>
+        <w:pStyle w:val="bum"/>
+        <w:spacing w:after="0"/>
+        <w:rPr>
+          <w:rStyle w:val="Finomhivatkozs"/>
+          <w:rFonts w:ascii="Times New Roman" w:hAnsi="Times New Roman" w:cs="Times New Roman"/>
+        </w:rPr>
+      </w:pPr>
+    </w:p>
+    <w:p>
+      <w:pPr>
+        <w:pStyle w:val="bum"/>
+        <w:spacing w:after="0"/>
+        <w:rPr>
+          <w:rStyle w:val="Finomhivatkozs"/>
+          <w:rFonts w:ascii="Times New Roman" w:hAnsi="Times New Roman" w:cs="Times New Roman"/>
+        </w:rPr>
+      </w:pPr>
+    </w:p>
+    <w:p>
+      <w:pPr>
+        <w:pStyle w:val="bum"/>
+        <w:spacing w:after="0"/>
+        <w:rPr>
+          <w:rStyle w:val="Finomhivatkozs"/>
+          <w:rFonts w:ascii="Times New Roman" w:hAnsi="Times New Roman" w:cs="Times New Roman"/>
+        </w:rPr>
+      </w:pPr>
+    </w:p>
+    <w:p>
+      <w:pPr>
+        <w:pStyle w:val="bum"/>
+        <w:spacing w:after="0"/>
+        <w:rPr>
+          <w:rStyle w:val="Finomhivatkozs"/>
+          <w:rFonts w:ascii="Times New Roman" w:hAnsi="Times New Roman" w:cs="Times New Roman"/>
+        </w:rPr>
+      </w:pPr>
+    </w:p>
+    <w:p>
+      <w:pPr>
+        <w:pStyle w:val="bum"/>
+        <w:spacing w:after="0"/>
+        <w:rPr>
+          <w:rStyle w:val="Finomhivatkozs"/>
+          <w:rFonts w:ascii="Times New Roman" w:hAnsi="Times New Roman" w:cs="Times New Roman"/>
+        </w:rPr>
+      </w:pPr>
+    </w:p>
+    <w:p>
+      <w:pPr>
+        <w:pStyle w:val="bum"/>
+        <w:spacing w:after="0"/>
+        <w:rPr>
+          <w:rStyle w:val="Finomhivatkozs"/>
+          <w:rFonts w:ascii="Times New Roman" w:hAnsi="Times New Roman" w:cs="Times New Roman"/>
+        </w:rPr>
+      </w:pPr>
+    </w:p>
+    <w:p>
+      <w:pPr>
+        <w:pStyle w:val="bum"/>
+        <w:spacing w:after="0"/>
+        <w:rPr>
+          <w:rStyle w:val="Finomhivatkozs"/>
+          <w:rFonts w:ascii="Times New Roman" w:hAnsi="Times New Roman" w:cs="Times New Roman"/>
+        </w:rPr>
+      </w:pPr>
+    </w:p>
+    <w:p>
+      <w:pPr>
+        <w:pStyle w:val="bum"/>
+        <w:spacing w:after="0"/>
+        <w:rPr>
+          <w:rStyle w:val="Finomhivatkozs"/>
+          <w:rFonts w:ascii="Times New Roman" w:hAnsi="Times New Roman" w:cs="Times New Roman"/>
+        </w:rPr>
+      </w:pPr>
+      <w:proofErr w:type="spellStart"/>
+      <w:r>
+        <w:rPr>
+          <w:rStyle w:val="Finomhivatkozs"/>
+          <w:rFonts w:ascii="Times New Roman" w:hAnsi="Times New Roman" w:cs="Times New Roman"/>
+        </w:rPr>
+        <w:lastRenderedPageBreak/>
+        <w:t>Telekomworkforce</w:t>
+      </w:r>
+      <w:proofErr w:type="spellEnd"/>
+      <w:r>
+        <w:rPr>
+          <w:rStyle w:val="Finomhivatkozs"/>
+          <w:rFonts w:ascii="Times New Roman" w:hAnsi="Times New Roman" w:cs="Times New Roman"/>
+        </w:rPr>
+        <w:t xml:space="preserve"> elérése kliensgépről: </w:t>
+      </w:r>
+    </w:p>
+    <w:p>
+      <w:pPr>
+        <w:pStyle w:val="bum"/>
+        <w:spacing w:after="0"/>
+        <w:rPr>
+          <w:rStyle w:val="Finomhivatkozs"/>
+          <w:rFonts w:ascii="Times New Roman" w:hAnsi="Times New Roman" w:cs="Times New Roman"/>
+        </w:rPr>
+      </w:pPr>
+      <w:r>
+        <w:rPr>
+          <w:rFonts w:ascii="Times New Roman" w:hAnsi="Times New Roman" w:cs="Times New Roman"/>
+          <w:noProof/>
+        </w:rPr>
+        <mc:AlternateContent>
+          <mc:Choice Requires="wps">
+            <w:drawing>
+              <wp:anchor distT="0" distB="0" distL="114300" distR="114300" simplePos="0" relativeHeight="251747328" behindDoc="0" locked="0" layoutInCell="1" allowOverlap="1" wp14:anchorId="6707964F" wp14:editId="179CBFDB">
+                <wp:simplePos x="0" y="0"/>
+                <wp:positionH relativeFrom="column">
+                  <wp:posOffset>376555</wp:posOffset>
+                </wp:positionH>
+                <wp:positionV relativeFrom="paragraph">
+                  <wp:posOffset>196215</wp:posOffset>
+                </wp:positionV>
+                <wp:extent cx="1606550" cy="304800"/>
+                <wp:effectExtent l="19050" t="19050" r="31750" b="38100"/>
+                <wp:wrapNone/>
+                <wp:docPr id="2043415011" name="Ellipszis 40"/>
+                <wp:cNvGraphicFramePr/>
+                <a:graphic xmlns:a="http://schemas.openxmlformats.org/drawingml/2006/main">
+                  <a:graphicData uri="http://schemas.microsoft.com/office/word/2010/wordprocessingShape">
+                    <wps:wsp>
+                      <wps:cNvSpPr/>
+                      <wps:spPr>
+                        <a:xfrm>
+                          <a:off x="0" y="0"/>
+                          <a:ext cx="1606550" cy="304800"/>
+                        </a:xfrm>
+                        <a:prstGeom prst="ellipse">
+                          <a:avLst/>
+                        </a:prstGeom>
+                        <a:noFill/>
+                        <a:ln w="57150">
+                          <a:solidFill>
+                            <a:srgbClr val="EE0000"/>
+                          </a:solidFill>
+                        </a:ln>
+                      </wps:spPr>
+                      <wps:style>
+                        <a:lnRef idx="2">
+                          <a:schemeClr val="accent1">
+                            <a:shade val="15000"/>
+                          </a:schemeClr>
+                        </a:lnRef>
+                        <a:fillRef idx="1">
+                          <a:schemeClr val="accent1"/>
+                        </a:fillRef>
+                        <a:effectRef idx="0">
+                          <a:schemeClr val="accent1"/>
+                        </a:effectRef>
+                        <a:fontRef idx="minor">
+                          <a:schemeClr val="lt1"/>
+                        </a:fontRef>
+                      </wps:style>
+                      <wps:bodyPr rot="0" spcFirstLastPara="0" vertOverflow="overflow" horzOverflow="overflow" vert="horz" wrap="square" lIns="91440" tIns="45720" rIns="91440" bIns="45720" numCol="1" spcCol="0" rtlCol="0" fromWordArt="0" anchor="ctr" anchorCtr="0" forceAA="0" compatLnSpc="1">
+                        <a:prstTxWarp prst="textNoShape">
+                          <a:avLst/>
+                        </a:prstTxWarp>
+                        <a:noAutofit/>
+                      </wps:bodyPr>
+                    </wps:wsp>
+                  </a:graphicData>
+                </a:graphic>
+              </wp:anchor>
+            </w:drawing>
+          </mc:Choice>
+          <mc:Fallback>
+            <w:pict>
+              <v:oval w14:anchorId="0EFD127C" id="Ellipszis 40" o:spid="_x0000_s1026" style="position:absolute;margin-left:29.65pt;margin-top:15.45pt;width:126.5pt;height:24pt;z-index:251747328;visibility:visible;mso-wrap-style:square;mso-wrap-distance-left:9pt;mso-wrap-distance-top:0;mso-wrap-distance-right:9pt;mso-wrap-distance-bottom:0;mso-position-horizontal:absolute;mso-position-horizontal-relative:text;mso-position-vertical:absolute;mso-position-vertical-relative:text;v-text-anchor:middle" o:gfxdata="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" filled="f" strokecolor="#e00" strokeweight="4.5pt">
+                <v:stroke joinstyle="miter"/>
+              </v:oval>
+            </w:pict>
+          </mc:Fallback>
+        </mc:AlternateContent>
+      </w:r>
+      <w:r>
+        <w:rPr>
+          <w:rFonts w:ascii="Times New Roman" w:hAnsi="Times New Roman" w:cs="Times New Roman"/>
+          <w:noProof/>
+        </w:rPr>
+        <w:drawing>
+          <wp:inline distT="0" distB="0" distL="0" distR="0" wp14:anchorId="5D6D15FC" wp14:editId="39CB7733">
+            <wp:extent cx="5638800" cy="3988556"/>
+            <wp:effectExtent l="0" t="0" r="0" b="0"/>
+            <wp:docPr id="1115070978" name="Kép 1"/>
+            <wp:cNvGraphicFramePr>
+              <a:graphicFrameLocks xmlns:a="http://schemas.openxmlformats.org/drawingml/2006/main" noChangeAspect="1"/>
+            </wp:cNvGraphicFramePr>
+            <a:graphic xmlns:a="http://schemas.openxmlformats.org/drawingml/2006/main">
+              <a:graphicData uri="http://schemas.openxmlformats.org/drawingml/2006/picture">
+                <pic:pic xmlns:pic="http://schemas.openxmlformats.org/drawingml/2006/picture">
+                  <pic:nvPicPr>
+                    <pic:cNvPr id="1115070978" name=""/>
+                    <pic:cNvPicPr/>
+                  </pic:nvPicPr>
+                  <pic:blipFill>
+                    <a:blip r:embed="rId63"/>
+                    <a:stretch>
+                      <a:fillRect/>
+                    </a:stretch>
+                  </pic:blipFill>
+                  <pic:spPr>
+                    <a:xfrm>
+                      <a:off x="0" y="0"/>
+                      <a:ext cx="5669376" cy="4010184"/>
+                    </a:xfrm>
+                    <a:prstGeom prst="rect">
+                      <a:avLst/>
+                    </a:prstGeom>
+                  </pic:spPr>
+                </pic:pic>
+              </a:graphicData>
+            </a:graphic>
+          </wp:inline>
+        </w:drawing>
+      </w:r>
+    </w:p>
+    <w:p>
+      <w:pPr>
+        <w:pStyle w:val="bum"/>
+        <w:rPr>
+          <w:rStyle w:val="Finomhivatkozs"/>
+          <w:rFonts w:ascii="Times New Roman" w:hAnsi="Times New Roman" w:cs="Times New Roman"/>
+        </w:rPr>
+      </w:pPr>
+      <w:r>
+        <w:rPr>
+          <w:rStyle w:val="Finomhivatkozs"/>
+          <w:rFonts w:ascii="Times New Roman" w:hAnsi="Times New Roman" w:cs="Times New Roman"/>
+        </w:rPr>
+        <w:t xml:space="preserve">A </w:t>
+      </w:r>
+      <w:proofErr w:type="spellStart"/>
+      <w:r>
+        <w:rPr>
+          <w:rStyle w:val="Finomhivatkozs"/>
+          <w:rFonts w:ascii="Times New Roman" w:hAnsi="Times New Roman" w:cs="Times New Roman"/>
+        </w:rPr>
+        <w:t>Domain</w:t>
+      </w:r>
+      <w:proofErr w:type="spellEnd"/>
+      <w:r>
+        <w:rPr>
+          <w:rStyle w:val="Finomhivatkozs"/>
+          <w:rFonts w:ascii="Times New Roman" w:hAnsi="Times New Roman" w:cs="Times New Roman"/>
+        </w:rPr>
+        <w:t xml:space="preserve"> lekérem kliensen és ellenőrzöm működését:</w:t>
+      </w:r>
+      <w:r>
+        <w:rPr>
+          <w:rStyle w:val="Finomhivatkozs"/>
+          <w:rFonts w:ascii="Times New Roman" w:hAnsi="Times New Roman" w:cs="Times New Roman"/>
+        </w:rPr>
+        <w:t xml:space="preserve"> </w:t>
+      </w:r>
+      <w:proofErr w:type="spellStart"/>
+      <w:r>
+        <w:rPr>
+          <w:rStyle w:val="Finomhivatkozs"/>
+          <w:rFonts w:ascii="Times New Roman" w:hAnsi="Times New Roman" w:cs="Times New Roman"/>
+          <w:highlight w:val="yellow"/>
+        </w:rPr>
+        <w:t>Get-ADDomain</w:t>
+      </w:r>
+      <w:proofErr w:type="spellEnd"/>
+    </w:p>
+    <w:p>
+      <w:pPr>
+        <w:pStyle w:val="bum"/>
+        <w:rPr>
+          <w:rStyle w:val="Finomhivatkozs"/>
+          <w:rFonts w:ascii="Times New Roman" w:hAnsi="Times New Roman" w:cs="Times New Roman"/>
+        </w:rPr>
+      </w:pPr>
+      <w:r>
+        <w:rPr>
+          <w:rFonts w:ascii="Times New Roman" w:hAnsi="Times New Roman" w:cs="Times New Roman"/>
+          <w:smallCaps/>
+          <w:noProof/>
+          <w:color w:val="5A5A5A" w:themeColor="text1" w:themeTint="A5"/>
+        </w:rPr>
+        <mc:AlternateContent>
+          <mc:Choice Requires="wps">
+            <w:drawing>
+              <wp:anchor distT="0" distB="0" distL="114300" distR="114300" simplePos="0" relativeHeight="251748352" behindDoc="0" locked="0" layoutInCell="1" allowOverlap="1" wp14:anchorId="70C5CB0F" wp14:editId="571F2826">
+                <wp:simplePos x="0" y="0"/>
+                <wp:positionH relativeFrom="column">
+                  <wp:posOffset>1905</wp:posOffset>
+                </wp:positionH>
+                <wp:positionV relativeFrom="paragraph">
+                  <wp:posOffset>1248410</wp:posOffset>
+                </wp:positionV>
+                <wp:extent cx="2400300" cy="196850"/>
+                <wp:effectExtent l="19050" t="19050" r="19050" b="12700"/>
+                <wp:wrapNone/>
+                <wp:docPr id="554240793" name="Téglalap 41"/>
+                <wp:cNvGraphicFramePr/>
+                <a:graphic xmlns:a="http://schemas.openxmlformats.org/drawingml/2006/main">
+                  <a:graphicData uri="http://schemas.microsoft.com/office/word/2010/wordprocessingShape">
+                    <wps:wsp>
+                      <wps:cNvSpPr/>
+                      <wps:spPr>
+                        <a:xfrm>
+                          <a:off x="0" y="0"/>
+                          <a:ext cx="2400300" cy="196850"/>
+                        </a:xfrm>
+                        <a:prstGeom prst="rect">
+                          <a:avLst/>
+                        </a:prstGeom>
+                        <a:noFill/>
+                        <a:ln w="38100">
+                          <a:solidFill>
+                            <a:srgbClr val="EE0000"/>
+                          </a:solidFill>
+                        </a:ln>
+                      </wps:spPr>
+                      <wps:style>
+                        <a:lnRef idx="2">
+                          <a:schemeClr val="accent1">
+                            <a:shade val="15000"/>
+                          </a:schemeClr>
+                        </a:lnRef>
+                        <a:fillRef idx="1">
+                          <a:schemeClr val="accent1"/>
+                        </a:fillRef>
+                        <a:effectRef idx="0">
+                          <a:schemeClr val="accent1"/>
+                        </a:effectRef>
+                        <a:fontRef idx="minor">
+                          <a:schemeClr val="lt1"/>
+                        </a:fontRef>
+                      </wps:style>
+                      <wps:bodyPr rot="0" spcFirstLastPara="0" vertOverflow="overflow" horzOverflow="overflow" vert="horz" wrap="square" lIns="91440" tIns="45720" rIns="91440" bIns="45720" numCol="1" spcCol="0" rtlCol="0" fromWordArt="0" anchor="ctr" anchorCtr="0" forceAA="0" compatLnSpc="1">
+                        <a:prstTxWarp prst="textNoShape">
+                          <a:avLst/>
+                        </a:prstTxWarp>
+                        <a:noAutofit/>
+                      </wps:bodyPr>
+                    </wps:wsp>
+                  </a:graphicData>
+                </a:graphic>
+              </wp:anchor>
+            </w:drawing>
+          </mc:Choice>
+          <mc:Fallback>
+            <w:pict>
+              <v:rect w14:anchorId="516AE09C" id="Téglalap 41" o:spid="_x0000_s1026" style="position:absolute;margin-left:.15pt;margin-top:98.3pt;width:189pt;height:15.5pt;z-index:251748352;visibility:visible;mso-wrap-style:square;mso-wrap-distance-left:9pt;mso-wrap-distance-top:0;mso-wrap-distance-right:9pt;mso-wrap-distance-bottom:0;mso-position-horizontal:absolute;mso-position-horizontal-relative:text;mso-position-vertical:absolute;mso-position-vertical-relative:text;v-text-anchor:middle" o:gfxdata="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" filled="f" strokecolor="#e00" strokeweight="3pt"/>
+            </w:pict>
+          </mc:Fallback>
+        </mc:AlternateContent>
+      </w:r>
+      <w:r>
+        <w:rPr>
+          <w:rStyle w:val="Finomhivatkozs"/>
+          <w:rFonts w:ascii="Times New Roman" w:hAnsi="Times New Roman" w:cs="Times New Roman"/>
+        </w:rPr>
+        <w:drawing>
+          <wp:inline distT="0" distB="0" distL="0" distR="0" wp14:anchorId="607E2D7A" wp14:editId="2FC0B4A5">
+            <wp:extent cx="5760720" cy="2834640"/>
+            <wp:effectExtent l="0" t="0" r="0" b="3810"/>
+            <wp:docPr id="1370562146" name="Kép 1"/>
+            <wp:cNvGraphicFramePr>
+              <a:graphicFrameLocks xmlns:a="http://schemas.openxmlformats.org/drawingml/2006/main" noChangeAspect="1"/>
+            </wp:cNvGraphicFramePr>
+            <a:graphic xmlns:a="http://schemas.openxmlformats.org/drawingml/2006/main">
+              <a:graphicData uri="http://schemas.openxmlformats.org/drawingml/2006/picture">
+                <pic:pic xmlns:pic="http://schemas.openxmlformats.org/drawingml/2006/picture">
+                  <pic:nvPicPr>
+                    <pic:cNvPr id="1370562146" name=""/>
+                    <pic:cNvPicPr/>
+                  </pic:nvPicPr>
+                  <pic:blipFill>
+                    <a:blip r:embed="rId64"/>
+                    <a:stretch>
+                      <a:fillRect/>
+                    </a:stretch>
+                  </pic:blipFill>
+                  <pic:spPr>
+                    <a:xfrm>
+                      <a:off x="0" y="0"/>
+                      <a:ext cx="5760720" cy="2834640"/>
+                    </a:xfrm>
+                    <a:prstGeom prst="rect">
+                      <a:avLst/>
+                    </a:prstGeom>
+                  </pic:spPr>
+                </pic:pic>
+              </a:graphicData>
+            </a:graphic>
+          </wp:inline>
+        </w:drawing>
+      </w:r>
+    </w:p>
+    <w:p>
+      <w:pPr>
+        <w:pStyle w:val="bum"/>
+        <w:rPr>
+          <w:rStyle w:val="Finomhivatkozs"/>
+          <w:rFonts w:ascii="Times New Roman" w:hAnsi="Times New Roman" w:cs="Times New Roman"/>
+        </w:rPr>
+      </w:pPr>
+      <w:r>
+        <w:rPr>
+          <w:rStyle w:val="Finomhivatkozs"/>
+          <w:rFonts w:ascii="Times New Roman" w:hAnsi="Times New Roman" w:cs="Times New Roman"/>
+        </w:rPr>
+        <w:t xml:space="preserve"> </w:t>
+      </w:r>
+    </w:p>
+    <w:p>
+      <w:pPr>
+        <w:pStyle w:val="bum"/>
+        <w:rPr>
+          <w:rStyle w:val="Finomhivatkozs"/>
+          <w:rFonts w:ascii="Times New Roman" w:hAnsi="Times New Roman" w:cs="Times New Roman"/>
+        </w:rPr>
+      </w:pPr>
+    </w:p>
+    <w:p>
+      <w:pPr>
+        <w:pStyle w:val="bum"/>
+        <w:rPr>
+          <w:rStyle w:val="Finomhivatkozs"/>
+          <w:rFonts w:ascii="Times New Roman" w:hAnsi="Times New Roman" w:cs="Times New Roman"/>
+        </w:rPr>
+      </w:pPr>
+    </w:p>
+    <w:p>
+      <w:pPr>
+        <w:pStyle w:val="bum"/>
+        <w:rPr>
+          <w:rStyle w:val="Finomhivatkozs"/>
+          <w:rFonts w:ascii="Times New Roman" w:hAnsi="Times New Roman" w:cs="Times New Roman"/>
+        </w:rPr>
+      </w:pPr>
     </w:p>
     <w:sectPr>
-      <w:headerReference w:type="default" r:id="rId57"/>
+      <w:headerReference w:type="default" r:id="rId65"/>
       <w:pgSz w:w="11906" w:h="16838"/>
       <w:pgMar w:top="1417" w:right="1417" w:bottom="1417" w:left="1417" w:header="708" w:footer="708" w:gutter="0"/>
       <w:cols w:space="708"/>
@@ -13109,10 +14576,10 @@
     </w:lvl>
   </w:abstractNum>
   <w:abstractNum w:abstractNumId="2" w15:restartNumberingAfterBreak="0">
-    <w:nsid w:val="495513B3"/>
+    <w:nsid w:val="3C816F1C"/>
     <w:multiLevelType w:val="hybridMultilevel"/>
-    <w:tmpl w:val="C11285A4"/>
-    <w:lvl w:ilvl="0" w:tplc="5A9CA552">
+    <w:tmpl w:val="6BC6E878"/>
+    <w:lvl w:ilvl="0" w:tplc="F47260DC">
       <w:numFmt w:val="bullet"/>
       <w:lvlText w:val="-"/>
       <w:lvlJc w:val="left"/>
@@ -13221,6 +14688,231 @@
     </w:lvl>
   </w:abstractNum>
   <w:abstractNum w:abstractNumId="3" w15:restartNumberingAfterBreak="0">
+    <w:nsid w:val="47C75B55"/>
+    <w:multiLevelType w:val="multilevel"/>
+    <w:tmpl w:val="442498FA"/>
+    <w:lvl w:ilvl="0">
+      <w:start w:val="1"/>
+      <w:numFmt w:val="decimal"/>
+      <w:lvlText w:val="%1."/>
+      <w:lvlJc w:val="left"/>
+      <w:pPr>
+        <w:tabs>
+          <w:tab w:val="num" w:pos="720"/>
+        </w:tabs>
+        <w:ind w:left="720" w:hanging="360"/>
+      </w:pPr>
+    </w:lvl>
+    <w:lvl w:ilvl="1" w:tentative="1">
+      <w:start w:val="1"/>
+      <w:numFmt w:val="decimal"/>
+      <w:lvlText w:val="%2."/>
+      <w:lvlJc w:val="left"/>
+      <w:pPr>
+        <w:tabs>
+          <w:tab w:val="num" w:pos="1440"/>
+        </w:tabs>
+        <w:ind w:left="1440" w:hanging="360"/>
+      </w:pPr>
+    </w:lvl>
+    <w:lvl w:ilvl="2" w:tentative="1">
+      <w:start w:val="1"/>
+      <w:numFmt w:val="decimal"/>
+      <w:lvlText w:val="%3."/>
+      <w:lvlJc w:val="left"/>
+      <w:pPr>
+        <w:tabs>
+          <w:tab w:val="num" w:pos="2160"/>
+        </w:tabs>
+        <w:ind w:left="2160" w:hanging="360"/>
+      </w:pPr>
+    </w:lvl>
+    <w:lvl w:ilvl="3" w:tentative="1">
+      <w:start w:val="1"/>
+      <w:numFmt w:val="decimal"/>
+      <w:lvlText w:val="%4."/>
+      <w:lvlJc w:val="left"/>
+      <w:pPr>
+        <w:tabs>
+          <w:tab w:val="num" w:pos="2880"/>
+        </w:tabs>
+        <w:ind w:left="2880" w:hanging="360"/>
+      </w:pPr>
+    </w:lvl>
+    <w:lvl w:ilvl="4" w:tentative="1">
+      <w:start w:val="1"/>
+      <w:numFmt w:val="decimal"/>
+      <w:lvlText w:val="%5."/>
+      <w:lvlJc w:val="left"/>
+      <w:pPr>
+        <w:tabs>
+          <w:tab w:val="num" w:pos="3600"/>
+        </w:tabs>
+        <w:ind w:left="3600" w:hanging="360"/>
+      </w:pPr>
+    </w:lvl>
+    <w:lvl w:ilvl="5" w:tentative="1">
+      <w:start w:val="1"/>
+      <w:numFmt w:val="decimal"/>
+      <w:lvlText w:val="%6."/>
+      <w:lvlJc w:val="left"/>
+      <w:pPr>
+        <w:tabs>
+          <w:tab w:val="num" w:pos="4320"/>
+        </w:tabs>
+        <w:ind w:left="4320" w:hanging="360"/>
+      </w:pPr>
+    </w:lvl>
+    <w:lvl w:ilvl="6" w:tentative="1">
+      <w:start w:val="1"/>
+      <w:numFmt w:val="decimal"/>
+      <w:lvlText w:val="%7."/>
+      <w:lvlJc w:val="left"/>
+      <w:pPr>
+        <w:tabs>
+          <w:tab w:val="num" w:pos="5040"/>
+        </w:tabs>
+        <w:ind w:left="5040" w:hanging="360"/>
+      </w:pPr>
+    </w:lvl>
+    <w:lvl w:ilvl="7" w:tentative="1">
+      <w:start w:val="1"/>
+      <w:numFmt w:val="decimal"/>
+      <w:lvlText w:val="%8."/>
+      <w:lvlJc w:val="left"/>
+      <w:pPr>
+        <w:tabs>
+          <w:tab w:val="num" w:pos="5760"/>
+        </w:tabs>
+        <w:ind w:left="5760" w:hanging="360"/>
+      </w:pPr>
+    </w:lvl>
+    <w:lvl w:ilvl="8" w:tentative="1">
+      <w:start w:val="1"/>
+      <w:numFmt w:val="decimal"/>
+      <w:lvlText w:val="%9."/>
+      <w:lvlJc w:val="left"/>
+      <w:pPr>
+        <w:tabs>
+          <w:tab w:val="num" w:pos="6480"/>
+        </w:tabs>
+        <w:ind w:left="6480" w:hanging="360"/>
+      </w:pPr>
+    </w:lvl>
+  </w:abstractNum>
+  <w:abstractNum w:abstractNumId="4" w15:restartNumberingAfterBreak="0">
+    <w:nsid w:val="495513B3"/>
+    <w:multiLevelType w:val="hybridMultilevel"/>
+    <w:tmpl w:val="C11285A4"/>
+    <w:lvl w:ilvl="0" w:tplc="5A9CA552">
+      <w:numFmt w:val="bullet"/>
+      <w:lvlText w:val="-"/>
+      <w:lvlJc w:val="left"/>
+      <w:pPr>
+        <w:ind w:left="720" w:hanging="360"/>
+      </w:pPr>
+      <w:rPr>
+        <w:rFonts w:ascii="Times New Roman" w:eastAsiaTheme="minorHAnsi" w:hAnsi="Times New Roman" w:cs="Times New Roman" w:hint="default"/>
+      </w:rPr>
+    </w:lvl>
+    <w:lvl w:ilvl="1" w:tplc="040E0003" w:tentative="1">
+      <w:start w:val="1"/>
+      <w:numFmt w:val="bullet"/>
+      <w:lvlText w:val="o"/>
+      <w:lvlJc w:val="left"/>
+      <w:pPr>
+        <w:ind w:left="1440" w:hanging="360"/>
+      </w:pPr>
+      <w:rPr>
+        <w:rFonts w:ascii="Courier New" w:hAnsi="Courier New" w:cs="Courier New" w:hint="default"/>
+      </w:rPr>
+    </w:lvl>
+    <w:lvl w:ilvl="2" w:tplc="040E0005" w:tentative="1">
+      <w:start w:val="1"/>
+      <w:numFmt w:val="bullet"/>
+      <w:lvlText w:val=""/>
+      <w:lvlJc w:val="left"/>
+      <w:pPr>
+        <w:ind w:left="2160" w:hanging="360"/>
+      </w:pPr>
+      <w:rPr>
+        <w:rFonts w:ascii="Wingdings" w:hAnsi="Wingdings" w:hint="default"/>
+      </w:rPr>
+    </w:lvl>
+    <w:lvl w:ilvl="3" w:tplc="040E0001" w:tentative="1">
+      <w:start w:val="1"/>
+      <w:numFmt w:val="bullet"/>
+      <w:lvlText w:val=""/>
+      <w:lvlJc w:val="left"/>
+      <w:pPr>
+        <w:ind w:left="2880" w:hanging="360"/>
+      </w:pPr>
+      <w:rPr>
+        <w:rFonts w:ascii="Symbol" w:hAnsi="Symbol" w:hint="default"/>
+      </w:rPr>
+    </w:lvl>
+    <w:lvl w:ilvl="4" w:tplc="040E0003" w:tentative="1">
+      <w:start w:val="1"/>
+      <w:numFmt w:val="bullet"/>
+      <w:lvlText w:val="o"/>
+      <w:lvlJc w:val="left"/>
+      <w:pPr>
+        <w:ind w:left="3600" w:hanging="360"/>
+      </w:pPr>
+      <w:rPr>
+        <w:rFonts w:ascii="Courier New" w:hAnsi="Courier New" w:cs="Courier New" w:hint="default"/>
+      </w:rPr>
+    </w:lvl>
+    <w:lvl w:ilvl="5" w:tplc="040E0005" w:tentative="1">
+      <w:start w:val="1"/>
+      <w:numFmt w:val="bullet"/>
+      <w:lvlText w:val=""/>
+      <w:lvlJc w:val="left"/>
+      <w:pPr>
+        <w:ind w:left="4320" w:hanging="360"/>
+      </w:pPr>
+      <w:rPr>
+        <w:rFonts w:ascii="Wingdings" w:hAnsi="Wingdings" w:hint="default"/>
+      </w:rPr>
+    </w:lvl>
+    <w:lvl w:ilvl="6" w:tplc="040E0001" w:tentative="1">
+      <w:start w:val="1"/>
+      <w:numFmt w:val="bullet"/>
+      <w:lvlText w:val=""/>
+      <w:lvlJc w:val="left"/>
+      <w:pPr>
+        <w:ind w:left="5040" w:hanging="360"/>
+      </w:pPr>
+      <w:rPr>
+        <w:rFonts w:ascii="Symbol" w:hAnsi="Symbol" w:hint="default"/>
+      </w:rPr>
+    </w:lvl>
+    <w:lvl w:ilvl="7" w:tplc="040E0003" w:tentative="1">
+      <w:start w:val="1"/>
+      <w:numFmt w:val="bullet"/>
+      <w:lvlText w:val="o"/>
+      <w:lvlJc w:val="left"/>
+      <w:pPr>
+        <w:ind w:left="5760" w:hanging="360"/>
+      </w:pPr>
+      <w:rPr>
+        <w:rFonts w:ascii="Courier New" w:hAnsi="Courier New" w:cs="Courier New" w:hint="default"/>
+      </w:rPr>
+    </w:lvl>
+    <w:lvl w:ilvl="8" w:tplc="040E0005" w:tentative="1">
+      <w:start w:val="1"/>
+      <w:numFmt w:val="bullet"/>
+      <w:lvlText w:val=""/>
+      <w:lvlJc w:val="left"/>
+      <w:pPr>
+        <w:ind w:left="6480" w:hanging="360"/>
+      </w:pPr>
+      <w:rPr>
+        <w:rFonts w:ascii="Wingdings" w:hAnsi="Wingdings" w:hint="default"/>
+      </w:rPr>
+    </w:lvl>
+  </w:abstractNum>
+  <w:abstractNum w:abstractNumId="5" w15:restartNumberingAfterBreak="0">
     <w:nsid w:val="4C6215E1"/>
     <w:multiLevelType w:val="hybridMultilevel"/>
     <w:tmpl w:val="05D0514C"/>
@@ -13333,7 +15025,7 @@
       </w:rPr>
     </w:lvl>
   </w:abstractNum>
-  <w:abstractNum w:abstractNumId="4" w15:restartNumberingAfterBreak="0">
+  <w:abstractNum w:abstractNumId="6" w15:restartNumberingAfterBreak="0">
     <w:nsid w:val="4CAD5143"/>
     <w:multiLevelType w:val="hybridMultilevel"/>
     <w:tmpl w:val="72C67F24"/>
@@ -13445,7 +15137,7 @@
       </w:rPr>
     </w:lvl>
   </w:abstractNum>
-  <w:abstractNum w:abstractNumId="5" w15:restartNumberingAfterBreak="0">
+  <w:abstractNum w:abstractNumId="7" w15:restartNumberingAfterBreak="0">
     <w:nsid w:val="61AF349E"/>
     <w:multiLevelType w:val="hybridMultilevel"/>
     <w:tmpl w:val="5B10EF8E"/>
@@ -13559,22 +15251,28 @@
     </w:lvl>
   </w:abstractNum>
   <w:num w:numId="1" w16cid:durableId="183053383">
-    <w:abstractNumId w:val="3"/>
+    <w:abstractNumId w:val="5"/>
   </w:num>
   <w:num w:numId="2" w16cid:durableId="1175804293">
     <w:abstractNumId w:val="0"/>
   </w:num>
   <w:num w:numId="3" w16cid:durableId="1069813107">
-    <w:abstractNumId w:val="2"/>
+    <w:abstractNumId w:val="4"/>
   </w:num>
   <w:num w:numId="4" w16cid:durableId="644942313">
-    <w:abstractNumId w:val="5"/>
+    <w:abstractNumId w:val="7"/>
   </w:num>
   <w:num w:numId="5" w16cid:durableId="167989137">
-    <w:abstractNumId w:val="4"/>
+    <w:abstractNumId w:val="6"/>
   </w:num>
   <w:num w:numId="6" w16cid:durableId="444732592">
     <w:abstractNumId w:val="1"/>
+  </w:num>
+  <w:num w:numId="7" w16cid:durableId="261039193">
+    <w:abstractNumId w:val="3"/>
+  </w:num>
+  <w:num w:numId="8" w16cid:durableId="1556165171">
+    <w:abstractNumId w:val="2"/>
   </w:num>
 </w:numbering>
 </file>
@@ -14182,7 +15880,6 @@
   <w:style w:type="character" w:default="1" w:styleId="Bekezdsalapbettpusa">
     <w:name w:val="Default Paragraph Font"/>
     <w:uiPriority w:val="1"/>
-    <w:semiHidden/>
     <w:unhideWhenUsed/>
   </w:style>
   <w:style w:type="table" w:default="1" w:styleId="Normltblzat">

</xml_diff>